<commit_message>
Fase 2: núcleo técnico (entidades, datos, login JWT y pruebas)
- Entidades y configuraciones EF generadas desde la BD (24 tablas)
- DbContext con baja lógica y auditoría automática, repositorios y Unit of Work
- Login con BCrypt y JWT, manejo global de errores, OpenAPI/Scalar y CORS
- Cadena de conexión y Jwt:Key solo por user-secrets o variables de entorno
- Scripts de BD parametrizados con NombreBD y usuarios de demostración
- 18 pruebas (unitarias e integración sobre SQL Server local)
- docs/Configuracion.md

Co-Authored-By: Claude Sonnet 5.5 <noreply@anthropic.com>
</commit_message>
<xml_diff>
--- a/Prompts/3_DesarrolloBackend.docx
+++ b/Prompts/3_DesarrolloBackend.docx
@@ -62,6 +62,9 @@
     </w:p>
     <w:p>
       <w:r>
+        <w:rPr>
+          <w:noProof/>
+        </w:rPr>
         <w:drawing>
           <wp:inline distT="0" distB="0" distL="0" distR="0" wp14:anchorId="7CFEE2F2" wp14:editId="1BFDB6F2">
             <wp:extent cx="5400040" cy="2452370"/>
@@ -99,6 +102,91 @@
         </w:drawing>
       </w:r>
     </w:p>
+    <w:p>
+      <w:r>
+        <w:t>Inicia la fase 2, usa user-secrets y variables de entorno, estos valores nunca deben subirse al repositorio de github.</w:t>
+      </w:r>
+    </w:p>
+    <w:p>
+      <w:r>
+        <w:drawing>
+          <wp:inline distT="0" distB="0" distL="0" distR="0" wp14:anchorId="00192ECD" wp14:editId="3178F647">
+            <wp:extent cx="5400040" cy="2082800"/>
+            <wp:effectExtent l="0" t="0" r="0" b="0"/>
+            <wp:docPr id="223792988" name="Imagen 1"/>
+            <wp:cNvGraphicFramePr>
+              <a:graphicFrameLocks xmlns:a="http://schemas.openxmlformats.org/drawingml/2006/main" noChangeAspect="1"/>
+            </wp:cNvGraphicFramePr>
+            <a:graphic xmlns:a="http://schemas.openxmlformats.org/drawingml/2006/main">
+              <a:graphicData uri="http://schemas.openxmlformats.org/drawingml/2006/picture">
+                <pic:pic xmlns:pic="http://schemas.openxmlformats.org/drawingml/2006/picture">
+                  <pic:nvPicPr>
+                    <pic:cNvPr id="223792988" name=""/>
+                    <pic:cNvPicPr/>
+                  </pic:nvPicPr>
+                  <pic:blipFill>
+                    <a:blip r:embed="rId6"/>
+                    <a:stretch>
+                      <a:fillRect/>
+                    </a:stretch>
+                  </pic:blipFill>
+                  <pic:spPr>
+                    <a:xfrm>
+                      <a:off x="0" y="0"/>
+                      <a:ext cx="5400040" cy="2082800"/>
+                    </a:xfrm>
+                    <a:prstGeom prst="rect">
+                      <a:avLst/>
+                    </a:prstGeom>
+                  </pic:spPr>
+                </pic:pic>
+              </a:graphicData>
+            </a:graphic>
+          </wp:inline>
+        </w:drawing>
+      </w:r>
+    </w:p>
+    <w:p>
+      <w:r>
+        <w:lastRenderedPageBreak/>
+        <w:drawing>
+          <wp:inline distT="0" distB="0" distL="0" distR="0" wp14:anchorId="5AC69835" wp14:editId="31963C3C">
+            <wp:extent cx="5400040" cy="845185"/>
+            <wp:effectExtent l="0" t="0" r="0" b="0"/>
+            <wp:docPr id="1397218862" name="Imagen 1"/>
+            <wp:cNvGraphicFramePr>
+              <a:graphicFrameLocks xmlns:a="http://schemas.openxmlformats.org/drawingml/2006/main" noChangeAspect="1"/>
+            </wp:cNvGraphicFramePr>
+            <a:graphic xmlns:a="http://schemas.openxmlformats.org/drawingml/2006/main">
+              <a:graphicData uri="http://schemas.openxmlformats.org/drawingml/2006/picture">
+                <pic:pic xmlns:pic="http://schemas.openxmlformats.org/drawingml/2006/picture">
+                  <pic:nvPicPr>
+                    <pic:cNvPr id="1397218862" name=""/>
+                    <pic:cNvPicPr/>
+                  </pic:nvPicPr>
+                  <pic:blipFill>
+                    <a:blip r:embed="rId7"/>
+                    <a:stretch>
+                      <a:fillRect/>
+                    </a:stretch>
+                  </pic:blipFill>
+                  <pic:spPr>
+                    <a:xfrm>
+                      <a:off x="0" y="0"/>
+                      <a:ext cx="5400040" cy="845185"/>
+                    </a:xfrm>
+                    <a:prstGeom prst="rect">
+                      <a:avLst/>
+                    </a:prstGeom>
+                  </pic:spPr>
+                </pic:pic>
+              </a:graphicData>
+            </a:graphic>
+          </wp:inline>
+        </w:drawing>
+      </w:r>
+    </w:p>
+    <w:p/>
     <w:sectPr>
       <w:pgSz w:w="11906" w:h="16838"/>
       <w:pgMar w:top="1417" w:right="1701" w:bottom="1417" w:left="1701" w:header="708" w:footer="708" w:gutter="0"/>

</xml_diff>

<commit_message>
Fase 4: contratos y cronograma de cuotas
- Alta de contratos en borrador con código CON-AAAA-NNNN desde tabSECUENCIA (atómico)
- Validaciones: fechas, duración máxima, local sin cruce de fechas ni en mantenimiento
- Autorización por un administrador distinto del que registró; genera el cronograma
  mensual (primera cuota completa, día de pago con ajuste en meses cortos) y ocupa el local
- Rescisión con anulación de cuotas futuras sin pagos y liberación del local
- Actualización de vencimientos al iniciar la API y cada 6 horas (y a pedido)
- Eventos de auditoría al autorizar y rescindir
- 49 pruebas nuevas (integración y unitarias del generador de cronograma)

Co-Authored-By: Claude Sonnet 5.5 <noreply@anthropic.com>
</commit_message>
<xml_diff>
--- a/Prompts/3_DesarrolloBackend.docx
+++ b/Prompts/3_DesarrolloBackend.docx
@@ -6,9 +6,11 @@
       <w:r>
         <w:t xml:space="preserve">Inicia la fase 0, esta debe estar contenida en la carpeta </w:t>
       </w:r>
+      <w:proofErr w:type="spellStart"/>
       <w:r>
         <w:t>Backend</w:t>
       </w:r>
+      <w:proofErr w:type="spellEnd"/>
       <w:r>
         <w:t>.</w:t>
       </w:r>
@@ -104,11 +106,30 @@
     </w:p>
     <w:p>
       <w:r>
-        <w:t>Inicia la fase 2, usa user-secrets y variables de entorno, estos valores nunca deben subirse al repositorio de github.</w:t>
+        <w:t xml:space="preserve">Inicia la fase 2, usa </w:t>
+      </w:r>
+      <w:proofErr w:type="spellStart"/>
+      <w:r>
+        <w:t>user-secrets</w:t>
+      </w:r>
+      <w:proofErr w:type="spellEnd"/>
+      <w:r>
+        <w:t xml:space="preserve"> y variables de entorno, estos valores nunca deben subirse al repositorio de </w:t>
+      </w:r>
+      <w:proofErr w:type="spellStart"/>
+      <w:r>
+        <w:t>github</w:t>
+      </w:r>
+      <w:proofErr w:type="spellEnd"/>
+      <w:r>
+        <w:t>.</w:t>
       </w:r>
     </w:p>
     <w:p>
       <w:r>
+        <w:rPr>
+          <w:noProof/>
+        </w:rPr>
         <w:drawing>
           <wp:inline distT="0" distB="0" distL="0" distR="0" wp14:anchorId="00192ECD" wp14:editId="3178F647">
             <wp:extent cx="5400040" cy="2082800"/>
@@ -148,6 +169,9 @@
     </w:p>
     <w:p>
       <w:r>
+        <w:rPr>
+          <w:noProof/>
+        </w:rPr>
         <w:lastRenderedPageBreak/>
         <w:drawing>
           <wp:inline distT="0" distB="0" distL="0" distR="0" wp14:anchorId="5AC69835" wp14:editId="31963C3C">
@@ -186,7 +210,137 @@
         </w:drawing>
       </w:r>
     </w:p>
-    <w:p/>
+    <w:p>
+      <w:r>
+        <w:t>Inicia la fase 3.</w:t>
+      </w:r>
+    </w:p>
+    <w:p>
+      <w:r>
+        <w:drawing>
+          <wp:inline distT="0" distB="0" distL="0" distR="0" wp14:anchorId="7A559CB2" wp14:editId="131CCEB2">
+            <wp:extent cx="5400040" cy="2084705"/>
+            <wp:effectExtent l="0" t="0" r="0" b="0"/>
+            <wp:docPr id="1822263271" name="Imagen 1"/>
+            <wp:cNvGraphicFramePr>
+              <a:graphicFrameLocks xmlns:a="http://schemas.openxmlformats.org/drawingml/2006/main" noChangeAspect="1"/>
+            </wp:cNvGraphicFramePr>
+            <a:graphic xmlns:a="http://schemas.openxmlformats.org/drawingml/2006/main">
+              <a:graphicData uri="http://schemas.openxmlformats.org/drawingml/2006/picture">
+                <pic:pic xmlns:pic="http://schemas.openxmlformats.org/drawingml/2006/picture">
+                  <pic:nvPicPr>
+                    <pic:cNvPr id="1822263271" name=""/>
+                    <pic:cNvPicPr/>
+                  </pic:nvPicPr>
+                  <pic:blipFill>
+                    <a:blip r:embed="rId8"/>
+                    <a:stretch>
+                      <a:fillRect/>
+                    </a:stretch>
+                  </pic:blipFill>
+                  <pic:spPr>
+                    <a:xfrm>
+                      <a:off x="0" y="0"/>
+                      <a:ext cx="5400040" cy="2084705"/>
+                    </a:xfrm>
+                    <a:prstGeom prst="rect">
+                      <a:avLst/>
+                    </a:prstGeom>
+                  </pic:spPr>
+                </pic:pic>
+              </a:graphicData>
+            </a:graphic>
+          </wp:inline>
+        </w:drawing>
+      </w:r>
+    </w:p>
+    <w:p>
+      <w:r>
+        <w:drawing>
+          <wp:inline distT="0" distB="0" distL="0" distR="0" wp14:anchorId="3A7E047E" wp14:editId="15843B8C">
+            <wp:extent cx="5400040" cy="858520"/>
+            <wp:effectExtent l="0" t="0" r="0" b="0"/>
+            <wp:docPr id="12358127" name="Imagen 1"/>
+            <wp:cNvGraphicFramePr>
+              <a:graphicFrameLocks xmlns:a="http://schemas.openxmlformats.org/drawingml/2006/main" noChangeAspect="1"/>
+            </wp:cNvGraphicFramePr>
+            <a:graphic xmlns:a="http://schemas.openxmlformats.org/drawingml/2006/main">
+              <a:graphicData uri="http://schemas.openxmlformats.org/drawingml/2006/picture">
+                <pic:pic xmlns:pic="http://schemas.openxmlformats.org/drawingml/2006/picture">
+                  <pic:nvPicPr>
+                    <pic:cNvPr id="12358127" name=""/>
+                    <pic:cNvPicPr/>
+                  </pic:nvPicPr>
+                  <pic:blipFill>
+                    <a:blip r:embed="rId9"/>
+                    <a:stretch>
+                      <a:fillRect/>
+                    </a:stretch>
+                  </pic:blipFill>
+                  <pic:spPr>
+                    <a:xfrm>
+                      <a:off x="0" y="0"/>
+                      <a:ext cx="5400040" cy="858520"/>
+                    </a:xfrm>
+                    <a:prstGeom prst="rect">
+                      <a:avLst/>
+                    </a:prstGeom>
+                  </pic:spPr>
+                </pic:pic>
+              </a:graphicData>
+            </a:graphic>
+          </wp:inline>
+        </w:drawing>
+      </w:r>
+    </w:p>
+    <w:p>
+      <w:r>
+        <w:t xml:space="preserve">Sobre las reglas a confirmar: 1. </w:t>
+      </w:r>
+      <w:r>
+        <w:t xml:space="preserve">Se cobra completo porque la entrega del local se hace cuando </w:t>
+      </w:r>
+      <w:proofErr w:type="gramStart"/>
+      <w:r>
+        <w:t>entra en vigencia</w:t>
+      </w:r>
+      <w:proofErr w:type="gramEnd"/>
+      <w:r>
+        <w:t xml:space="preserve"> el contrato. 2. Sí, el código se generará desde la tabla secuencia. En adelante, al culminar una fase, realiza el </w:t>
+      </w:r>
+      <w:proofErr w:type="spellStart"/>
+      <w:r>
+        <w:t>commit</w:t>
+      </w:r>
+      <w:proofErr w:type="spellEnd"/>
+      <w:r>
+        <w:t xml:space="preserve"> y </w:t>
+      </w:r>
+      <w:proofErr w:type="spellStart"/>
+      <w:r>
+        <w:t>push</w:t>
+      </w:r>
+      <w:proofErr w:type="spellEnd"/>
+      <w:r>
+        <w:t xml:space="preserve"> sin subir las carpetas </w:t>
+      </w:r>
+      <w:proofErr w:type="spellStart"/>
+      <w:r>
+        <w:t>bin</w:t>
+      </w:r>
+      <w:proofErr w:type="spellEnd"/>
+      <w:r>
+        <w:t xml:space="preserve">, </w:t>
+      </w:r>
+      <w:proofErr w:type="spellStart"/>
+      <w:r>
+        <w:t>obj</w:t>
+      </w:r>
+      <w:proofErr w:type="spellEnd"/>
+      <w:r>
+        <w:t xml:space="preserve"> y cualquier dato que sea sensible al repositorio.</w:t>
+      </w:r>
+    </w:p>
     <w:sectPr>
       <w:pgSz w:w="11906" w:h="16838"/>
       <w:pgMar w:top="1417" w:right="1701" w:bottom="1417" w:left="1701" w:header="708" w:footer="708" w:gutter="0"/>

</xml_diff>

<commit_message>
Fase 5: pagos y morosidad
- Registro de pagos totales o parciales aplicados a cuotas, sin sobrepago
- Estado de la cuota (pendiente, pago parcial, pagada) recalculado al registrar y anular
- Bloqueo de la cuota en transacción para evitar pagos simultáneos que excedan el saldo
- Anulación de pagos por el administrador con motivo y auditoría en tabEVENTOS
- Morosidad por cliente y detalle de cuotas vencidas, calculada a la fecha de hoy
- 39 pruebas nuevas, incluidas las de concurrencia

Co-Authored-By: Claude Sonnet 5.5 <noreply@anthropic.com>
</commit_message>
<xml_diff>
--- a/Prompts/3_DesarrolloBackend.docx
+++ b/Prompts/3_DesarrolloBackend.docx
@@ -6,11 +6,9 @@
       <w:r>
         <w:t xml:space="preserve">Inicia la fase 0, esta debe estar contenida en la carpeta </w:t>
       </w:r>
-      <w:proofErr w:type="spellStart"/>
       <w:r>
         <w:t>Backend</w:t>
       </w:r>
-      <w:proofErr w:type="spellEnd"/>
       <w:r>
         <w:t>.</w:t>
       </w:r>
@@ -106,23 +104,7 @@
     </w:p>
     <w:p>
       <w:r>
-        <w:t xml:space="preserve">Inicia la fase 2, usa </w:t>
-      </w:r>
-      <w:proofErr w:type="spellStart"/>
-      <w:r>
-        <w:t>user-secrets</w:t>
-      </w:r>
-      <w:proofErr w:type="spellEnd"/>
-      <w:r>
-        <w:t xml:space="preserve"> y variables de entorno, estos valores nunca deben subirse al repositorio de </w:t>
-      </w:r>
-      <w:proofErr w:type="spellStart"/>
-      <w:r>
-        <w:t>github</w:t>
-      </w:r>
-      <w:proofErr w:type="spellEnd"/>
-      <w:r>
-        <w:t>.</w:t>
+        <w:t>Inicia la fase 2, usa user-secrets y variables de entorno, estos valores nunca deben subirse al repositorio de github.</w:t>
       </w:r>
     </w:p>
     <w:p>
@@ -217,6 +199,9 @@
     </w:p>
     <w:p>
       <w:r>
+        <w:rPr>
+          <w:noProof/>
+        </w:rPr>
         <w:drawing>
           <wp:inline distT="0" distB="0" distL="0" distR="0" wp14:anchorId="7A559CB2" wp14:editId="131CCEB2">
             <wp:extent cx="5400040" cy="2084705"/>
@@ -256,6 +241,9 @@
     </w:p>
     <w:p>
       <w:r>
+        <w:rPr>
+          <w:noProof/>
+        </w:rPr>
         <w:drawing>
           <wp:inline distT="0" distB="0" distL="0" distR="0" wp14:anchorId="3A7E047E" wp14:editId="15843B8C">
             <wp:extent cx="5400040" cy="858520"/>
@@ -298,47 +286,46 @@
         <w:t xml:space="preserve">Sobre las reglas a confirmar: 1. </w:t>
       </w:r>
       <w:r>
-        <w:t xml:space="preserve">Se cobra completo porque la entrega del local se hace cuando </w:t>
+        <w:t>Se cobra completo porque la entrega del local se hace cuando entra en vigencia el contrato. 2. Sí, el código se generará desde la tabla secuencia. En adelante, al culminar una fase, realiza el commit y push sin subir las carpetas bin, obj y cualquier dato que sea sensible al repositorio.</w:t>
       </w:r>
-      <w:proofErr w:type="gramStart"/>
+    </w:p>
+    <w:p>
       <w:r>
-        <w:t>entra en vigencia</w:t>
-      </w:r>
-      <w:proofErr w:type="gramEnd"/>
-      <w:r>
-        <w:t xml:space="preserve"> el contrato. 2. Sí, el código se generará desde la tabla secuencia. En adelante, al culminar una fase, realiza el </w:t>
-      </w:r>
-      <w:proofErr w:type="spellStart"/>
-      <w:r>
-        <w:t>commit</w:t>
-      </w:r>
-      <w:proofErr w:type="spellEnd"/>
-      <w:r>
-        <w:t xml:space="preserve"> y </w:t>
-      </w:r>
-      <w:proofErr w:type="spellStart"/>
-      <w:r>
-        <w:t>push</w:t>
-      </w:r>
-      <w:proofErr w:type="spellEnd"/>
-      <w:r>
-        <w:t xml:space="preserve"> sin subir las carpetas </w:t>
-      </w:r>
-      <w:proofErr w:type="spellStart"/>
-      <w:r>
-        <w:t>bin</w:t>
-      </w:r>
-      <w:proofErr w:type="spellEnd"/>
-      <w:r>
-        <w:t xml:space="preserve">, </w:t>
-      </w:r>
-      <w:proofErr w:type="spellStart"/>
-      <w:r>
-        <w:t>obj</w:t>
-      </w:r>
-      <w:proofErr w:type="spellEnd"/>
-      <w:r>
-        <w:t xml:space="preserve"> y cualquier dato que sea sensible al repositorio.</w:t>
+        <w:drawing>
+          <wp:inline distT="0" distB="0" distL="0" distR="0" wp14:anchorId="00E9C063" wp14:editId="49522FFE">
+            <wp:extent cx="5400040" cy="2395220"/>
+            <wp:effectExtent l="0" t="0" r="0" b="5080"/>
+            <wp:docPr id="1801796403" name="Imagen 1"/>
+            <wp:cNvGraphicFramePr>
+              <a:graphicFrameLocks xmlns:a="http://schemas.openxmlformats.org/drawingml/2006/main" noChangeAspect="1"/>
+            </wp:cNvGraphicFramePr>
+            <a:graphic xmlns:a="http://schemas.openxmlformats.org/drawingml/2006/main">
+              <a:graphicData uri="http://schemas.openxmlformats.org/drawingml/2006/picture">
+                <pic:pic xmlns:pic="http://schemas.openxmlformats.org/drawingml/2006/picture">
+                  <pic:nvPicPr>
+                    <pic:cNvPr id="1801796403" name=""/>
+                    <pic:cNvPicPr/>
+                  </pic:nvPicPr>
+                  <pic:blipFill>
+                    <a:blip r:embed="rId10"/>
+                    <a:stretch>
+                      <a:fillRect/>
+                    </a:stretch>
+                  </pic:blipFill>
+                  <pic:spPr>
+                    <a:xfrm>
+                      <a:off x="0" y="0"/>
+                      <a:ext cx="5400040" cy="2395220"/>
+                    </a:xfrm>
+                    <a:prstGeom prst="rect">
+                      <a:avLst/>
+                    </a:prstGeom>
+                  </pic:spPr>
+                </pic:pic>
+              </a:graphicData>
+            </a:graphic>
+          </wp:inline>
+        </w:drawing>
       </w:r>
     </w:p>
     <w:sectPr>

</xml_diff>

<commit_message>
Fase 6: analíticas del dashboard
- Endpoints de solo lectura: resumen, ocupación, ingresos esperados vs cobrados por mes,
  morosidad con antigüedad, contratos por vencer, y tops de locales y clientes
- Filtro opcional por empresa en todos; rangos y cantidades validados
- Resultados contrastados con las vistas SQL de la fase 1 sobre los datos de demostración
- 38 pruebas nuevas con valores exactos (cada prueba crea su propia empresa)

Co-Authored-By: Claude Sonnet 5.5 <noreply@anthropic.com>
</commit_message>
<xml_diff>
--- a/Prompts/3_DesarrolloBackend.docx
+++ b/Prompts/3_DesarrolloBackend.docx
@@ -6,9 +6,11 @@
       <w:r>
         <w:t xml:space="preserve">Inicia la fase 0, esta debe estar contenida en la carpeta </w:t>
       </w:r>
+      <w:proofErr w:type="spellStart"/>
       <w:r>
         <w:t>Backend</w:t>
       </w:r>
+      <w:proofErr w:type="spellEnd"/>
       <w:r>
         <w:t>.</w:t>
       </w:r>
@@ -104,7 +106,23 @@
     </w:p>
     <w:p>
       <w:r>
-        <w:t>Inicia la fase 2, usa user-secrets y variables de entorno, estos valores nunca deben subirse al repositorio de github.</w:t>
+        <w:t xml:space="preserve">Inicia la fase 2, usa </w:t>
+      </w:r>
+      <w:proofErr w:type="spellStart"/>
+      <w:r>
+        <w:t>user-secrets</w:t>
+      </w:r>
+      <w:proofErr w:type="spellEnd"/>
+      <w:r>
+        <w:t xml:space="preserve"> y variables de entorno, estos valores nunca deben subirse al repositorio de </w:t>
+      </w:r>
+      <w:proofErr w:type="spellStart"/>
+      <w:r>
+        <w:t>github</w:t>
+      </w:r>
+      <w:proofErr w:type="spellEnd"/>
+      <w:r>
+        <w:t>.</w:t>
       </w:r>
     </w:p>
     <w:p>
@@ -286,7 +304,47 @@
         <w:t xml:space="preserve">Sobre las reglas a confirmar: 1. </w:t>
       </w:r>
       <w:r>
-        <w:t>Se cobra completo porque la entrega del local se hace cuando entra en vigencia el contrato. 2. Sí, el código se generará desde la tabla secuencia. En adelante, al culminar una fase, realiza el commit y push sin subir las carpetas bin, obj y cualquier dato que sea sensible al repositorio.</w:t>
+        <w:t xml:space="preserve">Se cobra completo porque la entrega del local se hace cuando </w:t>
+      </w:r>
+      <w:proofErr w:type="gramStart"/>
+      <w:r>
+        <w:t>entra en vigencia</w:t>
+      </w:r>
+      <w:proofErr w:type="gramEnd"/>
+      <w:r>
+        <w:t xml:space="preserve"> el contrato. 2. Sí, el código se generará desde la tabla secuencia. En adelante, al culminar una fase, realiza el </w:t>
+      </w:r>
+      <w:proofErr w:type="spellStart"/>
+      <w:r>
+        <w:t>commit</w:t>
+      </w:r>
+      <w:proofErr w:type="spellEnd"/>
+      <w:r>
+        <w:t xml:space="preserve"> y </w:t>
+      </w:r>
+      <w:proofErr w:type="spellStart"/>
+      <w:r>
+        <w:t>push</w:t>
+      </w:r>
+      <w:proofErr w:type="spellEnd"/>
+      <w:r>
+        <w:t xml:space="preserve"> sin subir las carpetas </w:t>
+      </w:r>
+      <w:proofErr w:type="spellStart"/>
+      <w:r>
+        <w:t>bin</w:t>
+      </w:r>
+      <w:proofErr w:type="spellEnd"/>
+      <w:r>
+        <w:t xml:space="preserve">, </w:t>
+      </w:r>
+      <w:proofErr w:type="spellStart"/>
+      <w:r>
+        <w:t>obj</w:t>
+      </w:r>
+      <w:proofErr w:type="spellEnd"/>
+      <w:r>
+        <w:t xml:space="preserve"> y cualquier dato que sea sensible al repositorio.</w:t>
       </w:r>
     </w:p>
     <w:p>
@@ -326,6 +384,56 @@
             </a:graphic>
           </wp:inline>
         </w:drawing>
+      </w:r>
+    </w:p>
+    <w:p>
+      <w:r>
+        <w:t>Inicia la fase 5</w:t>
+      </w:r>
+    </w:p>
+    <w:p>
+      <w:r>
+        <w:lastRenderedPageBreak/>
+        <w:drawing>
+          <wp:inline distT="0" distB="0" distL="0" distR="0" wp14:anchorId="7F7BFC89" wp14:editId="7F4FC304">
+            <wp:extent cx="5400040" cy="1949450"/>
+            <wp:effectExtent l="0" t="0" r="0" b="0"/>
+            <wp:docPr id="255684392" name="Imagen 1"/>
+            <wp:cNvGraphicFramePr>
+              <a:graphicFrameLocks xmlns:a="http://schemas.openxmlformats.org/drawingml/2006/main" noChangeAspect="1"/>
+            </wp:cNvGraphicFramePr>
+            <a:graphic xmlns:a="http://schemas.openxmlformats.org/drawingml/2006/main">
+              <a:graphicData uri="http://schemas.openxmlformats.org/drawingml/2006/picture">
+                <pic:pic xmlns:pic="http://schemas.openxmlformats.org/drawingml/2006/picture">
+                  <pic:nvPicPr>
+                    <pic:cNvPr id="255684392" name=""/>
+                    <pic:cNvPicPr/>
+                  </pic:nvPicPr>
+                  <pic:blipFill>
+                    <a:blip r:embed="rId11"/>
+                    <a:stretch>
+                      <a:fillRect/>
+                    </a:stretch>
+                  </pic:blipFill>
+                  <pic:spPr>
+                    <a:xfrm>
+                      <a:off x="0" y="0"/>
+                      <a:ext cx="5400040" cy="1949450"/>
+                    </a:xfrm>
+                    <a:prstGeom prst="rect">
+                      <a:avLst/>
+                    </a:prstGeom>
+                  </pic:spPr>
+                </pic:pic>
+              </a:graphicData>
+            </a:graphic>
+          </wp:inline>
+        </w:drawing>
+      </w:r>
+    </w:p>
+    <w:p>
+      <w:r>
+        <w:t>Inicia la fase 6</w:t>
       </w:r>
     </w:p>
     <w:sectPr>

</xml_diff>